<commit_message>
Updated Topic Document and Trip Class
</commit_message>
<xml_diff>
--- a/Project/Documentation/Project_Topic_Document.docx
+++ b/Project/Documentation/Project_Topic_Document.docx
@@ -73,15 +73,7 @@
         <w:t xml:space="preserve"> </w:t>
       </w:r>
       <w:r>
-        <w:t xml:space="preserve">It can be </w:t>
-      </w:r>
-      <w:proofErr w:type="gramStart"/>
-      <w:r>
-        <w:t>anything really</w:t>
-      </w:r>
-      <w:proofErr w:type="gramEnd"/>
-      <w:r>
-        <w:t xml:space="preserve"> but something that would take some manipulation / calculations based on the input fields.  </w:t>
+        <w:t xml:space="preserve">It can be anything really but something that would take some manipulation / calculations based on the input fields.  </w:t>
       </w:r>
       <w:r>
         <w:t>You may make up some details to allow calculation</w:t>
@@ -139,7 +131,7 @@
           </w:tcPr>
           <w:p>
             <w:r>
-              <w:t>Yasir</w:t>
+              <w:t>Yasir Al Muhib</w:t>
             </w:r>
           </w:p>
         </w:tc>
@@ -161,7 +153,7 @@
           </w:tcPr>
           <w:p>
             <w:r>
-              <w:t>Peter</w:t>
+              <w:t>Peter Logan</w:t>
             </w:r>
           </w:p>
         </w:tc>
@@ -183,7 +175,7 @@
           </w:tcPr>
           <w:p>
             <w:r>
-              <w:t>Bivan</w:t>
+              <w:t>Bivan Fedha</w:t>
             </w:r>
           </w:p>
         </w:tc>
@@ -450,11 +442,9 @@
             <w:tcW w:w="2306" w:type="dxa"/>
           </w:tcPr>
           <w:p>
-            <w:proofErr w:type="spellStart"/>
             <w:r>
               <w:t>numberOfTravelers</w:t>
             </w:r>
-            <w:proofErr w:type="spellEnd"/>
           </w:p>
         </w:tc>
         <w:tc>
@@ -484,11 +474,9 @@
             <w:tcW w:w="2306" w:type="dxa"/>
           </w:tcPr>
           <w:p>
-            <w:proofErr w:type="spellStart"/>
             <w:r>
               <w:t>numberOfDays</w:t>
             </w:r>
-            <w:proofErr w:type="spellEnd"/>
           </w:p>
         </w:tc>
         <w:tc>
@@ -518,11 +506,9 @@
             <w:tcW w:w="2306" w:type="dxa"/>
           </w:tcPr>
           <w:p>
-            <w:proofErr w:type="spellStart"/>
             <w:r>
               <w:t>flightCost</w:t>
             </w:r>
-            <w:proofErr w:type="spellEnd"/>
           </w:p>
         </w:tc>
         <w:tc>
@@ -552,11 +538,9 @@
             <w:tcW w:w="2306" w:type="dxa"/>
           </w:tcPr>
           <w:p>
-            <w:proofErr w:type="spellStart"/>
             <w:r>
               <w:t>hotelCostPerNight</w:t>
             </w:r>
-            <w:proofErr w:type="spellEnd"/>
           </w:p>
         </w:tc>
         <w:tc>
@@ -586,11 +570,9 @@
             <w:tcW w:w="2306" w:type="dxa"/>
           </w:tcPr>
           <w:p>
-            <w:proofErr w:type="spellStart"/>
             <w:r>
               <w:t>foodCostPerDay</w:t>
             </w:r>
-            <w:proofErr w:type="spellEnd"/>
           </w:p>
         </w:tc>
         <w:tc>
@@ -620,11 +602,9 @@
             <w:tcW w:w="2306" w:type="dxa"/>
           </w:tcPr>
           <w:p>
-            <w:proofErr w:type="spellStart"/>
             <w:r>
               <w:t>transportationCost</w:t>
             </w:r>
-            <w:proofErr w:type="spellEnd"/>
           </w:p>
         </w:tc>
         <w:tc>
@@ -654,11 +634,9 @@
             <w:tcW w:w="2306" w:type="dxa"/>
           </w:tcPr>
           <w:p>
-            <w:proofErr w:type="spellStart"/>
             <w:r>
               <w:t>activitiesCost</w:t>
             </w:r>
-            <w:proofErr w:type="spellEnd"/>
           </w:p>
         </w:tc>
         <w:tc>
@@ -691,11 +669,9 @@
             <w:tcW w:w="2306" w:type="dxa"/>
           </w:tcPr>
           <w:p>
-            <w:proofErr w:type="spellStart"/>
             <w:r>
               <w:t>travelInsurance</w:t>
             </w:r>
-            <w:proofErr w:type="spellEnd"/>
           </w:p>
         </w:tc>
         <w:tc>
@@ -725,11 +701,9 @@
             <w:tcW w:w="2306" w:type="dxa"/>
           </w:tcPr>
           <w:p>
-            <w:proofErr w:type="spellStart"/>
             <w:r>
               <w:t>otherExpenses</w:t>
             </w:r>
-            <w:proofErr w:type="spellEnd"/>
           </w:p>
         </w:tc>
         <w:tc>
@@ -826,19 +800,7 @@
                     <w:rPr>
                       <w:lang w:val="en-CA"/>
                     </w:rPr>
-                    <w:t>Any additional expenses not included in the</w:t>
-                  </w:r>
-                  <w:r>
-                    <w:rPr>
-                      <w:lang w:val="en-CA"/>
-                    </w:rPr>
-                    <w:t xml:space="preserve"> </w:t>
-                  </w:r>
-                  <w:r>
-                    <w:rPr>
-                      <w:lang w:val="en-CA"/>
-                    </w:rPr>
-                    <w:t>other categories.</w:t>
+                    <w:t>Any additional expenses not included in the other categories.</w:t>
                   </w:r>
                 </w:p>
               </w:tc>
@@ -889,27 +851,11 @@
     </w:p>
     <w:p>
       <w:r>
-        <w:t xml:space="preserve">Once the document is completed, move the </w:t>
-      </w:r>
-      <w:proofErr w:type="gramStart"/>
-      <w:r>
-        <w:t>details</w:t>
-      </w:r>
-      <w:proofErr w:type="gramEnd"/>
-      <w:r>
-        <w:t xml:space="preserve"> a repository that you create.  The developer creates the repository for the topic that they will be coding.  Add the other two project group </w:t>
+        <w:t xml:space="preserve">Once the document is completed, move the details a repository that you create.  The developer creates the repository for the topic that they will be coding.  Add the other two project group </w:t>
       </w:r>
       <w:r>
         <w:lastRenderedPageBreak/>
-        <w:t xml:space="preserve">members to the </w:t>
-      </w:r>
-      <w:proofErr w:type="gramStart"/>
-      <w:r>
-        <w:t>repository(</w:t>
-      </w:r>
-      <w:proofErr w:type="gramEnd"/>
-      <w:r>
-        <w:t xml:space="preserve">or make public).  Add this document to the repository (Commit/Push).  </w:t>
+        <w:t xml:space="preserve">members to the repository(or make public).  Add this document to the repository (Commit/Push).  </w:t>
       </w:r>
       <w:r>
         <w:t>The description is to be added to the readme file of the repository.</w:t>
@@ -1528,6 +1474,7 @@
   <w:style w:type="character" w:default="1" w:styleId="DefaultParagraphFont">
     <w:name w:val="Default Paragraph Font"/>
     <w:uiPriority w:val="1"/>
+    <w:semiHidden/>
     <w:unhideWhenUsed/>
   </w:style>
   <w:style w:type="table" w:default="1" w:styleId="TableNormal">
@@ -2170,6 +2117,23 @@
 </file>
 
 <file path=customXml/item1.xml><?xml version="1.0" encoding="utf-8"?>
+<p:properties xmlns:p="http://schemas.microsoft.com/office/2006/metadata/properties" xmlns:xsi="http://www.w3.org/2001/XMLSchema-instance" xmlns:pc="http://schemas.microsoft.com/office/infopath/2007/PartnerControls">
+  <documentManagement>
+    <_activity xmlns="247560cf-935a-4eea-8698-2279bd6ff8a8" xsi:nil="true"/>
+  </documentManagement>
+</p:properties>
+</file>
+
+<file path=customXml/item2.xml><?xml version="1.0" encoding="utf-8"?>
+<?mso-contentType ?>
+<FormTemplates xmlns="http://schemas.microsoft.com/sharepoint/v3/contenttype/forms">
+  <Display>DocumentLibraryForm</Display>
+  <Edit>DocumentLibraryForm</Edit>
+  <New>DocumentLibraryForm</New>
+</FormTemplates>
+</file>
+
+<file path=customXml/item3.xml><?xml version="1.0" encoding="utf-8"?>
 <ct:contentTypeSchema xmlns:ct="http://schemas.microsoft.com/office/2006/metadata/contentType" xmlns:ma="http://schemas.microsoft.com/office/2006/metadata/properties/metaAttributes" ct:_="" ma:_="" ma:contentTypeName="Document" ma:contentTypeID="0x010100C6DF0D2C56292A4DB617915652A3C33A" ma:contentTypeVersion="11" ma:contentTypeDescription="Create a new document." ma:contentTypeScope="" ma:versionID="a61ff6edf4a5d68d5f8dfa88608614c3">
   <xsd:schema xmlns:xsd="http://www.w3.org/2001/XMLSchema" xmlns:xs="http://www.w3.org/2001/XMLSchema" xmlns:p="http://schemas.microsoft.com/office/2006/metadata/properties" xmlns:ns3="247560cf-935a-4eea-8698-2279bd6ff8a8" targetNamespace="http://schemas.microsoft.com/office/2006/metadata/properties" ma:root="true" ma:fieldsID="45b1cfb975cc18930692cb31d495395d" ns3:_="">
     <xsd:import namespace="247560cf-935a-4eea-8698-2279bd6ff8a8"/>
@@ -2357,24 +2321,25 @@
 </ct:contentTypeSchema>
 </file>
 
-<file path=customXml/item2.xml><?xml version="1.0" encoding="utf-8"?>
-<?mso-contentType ?>
-<FormTemplates xmlns="http://schemas.microsoft.com/sharepoint/v3/contenttype/forms">
-  <Display>DocumentLibraryForm</Display>
-  <Edit>DocumentLibraryForm</Edit>
-  <New>DocumentLibraryForm</New>
-</FormTemplates>
+<file path=customXml/itemProps1.xml><?xml version="1.0" encoding="utf-8"?>
+<ds:datastoreItem xmlns:ds="http://schemas.openxmlformats.org/officeDocument/2006/customXml" ds:itemID="{BF698040-0947-4A5E-AAFE-DC44920C1F5E}">
+  <ds:schemaRefs>
+    <ds:schemaRef ds:uri="http://schemas.microsoft.com/office/2006/metadata/properties"/>
+    <ds:schemaRef ds:uri="http://schemas.microsoft.com/office/infopath/2007/PartnerControls"/>
+    <ds:schemaRef ds:uri="247560cf-935a-4eea-8698-2279bd6ff8a8"/>
+  </ds:schemaRefs>
+</ds:datastoreItem>
 </file>
 
-<file path=customXml/item3.xml><?xml version="1.0" encoding="utf-8"?>
-<p:properties xmlns:p="http://schemas.microsoft.com/office/2006/metadata/properties" xmlns:xsi="http://www.w3.org/2001/XMLSchema-instance" xmlns:pc="http://schemas.microsoft.com/office/infopath/2007/PartnerControls">
-  <documentManagement>
-    <_activity xmlns="247560cf-935a-4eea-8698-2279bd6ff8a8" xsi:nil="true"/>
-  </documentManagement>
-</p:properties>
+<file path=customXml/itemProps2.xml><?xml version="1.0" encoding="utf-8"?>
+<ds:datastoreItem xmlns:ds="http://schemas.openxmlformats.org/officeDocument/2006/customXml" ds:itemID="{56832C46-10B1-4FA9-8456-BFF4CE21ED8D}">
+  <ds:schemaRefs>
+    <ds:schemaRef ds:uri="http://schemas.microsoft.com/sharepoint/v3/contenttype/forms"/>
+  </ds:schemaRefs>
+</ds:datastoreItem>
 </file>
 
-<file path=customXml/itemProps1.xml><?xml version="1.0" encoding="utf-8"?>
+<file path=customXml/itemProps3.xml><?xml version="1.0" encoding="utf-8"?>
 <ds:datastoreItem xmlns:ds="http://schemas.openxmlformats.org/officeDocument/2006/customXml" ds:itemID="{B1E79B56-43FB-411A-81B0-0D7F7644D0CA}">
   <ds:schemaRefs>
     <ds:schemaRef ds:uri="http://schemas.microsoft.com/office/2006/metadata/contentType"/>
@@ -2390,22 +2355,4 @@
     <ds:schemaRef ds:uri="http://schemas.microsoft.com/internal/obd"/>
   </ds:schemaRefs>
 </ds:datastoreItem>
-</file>
-
-<file path=customXml/itemProps2.xml><?xml version="1.0" encoding="utf-8"?>
-<ds:datastoreItem xmlns:ds="http://schemas.openxmlformats.org/officeDocument/2006/customXml" ds:itemID="{56832C46-10B1-4FA9-8456-BFF4CE21ED8D}">
-  <ds:schemaRefs>
-    <ds:schemaRef ds:uri="http://schemas.microsoft.com/sharepoint/v3/contenttype/forms"/>
-  </ds:schemaRefs>
-</ds:datastoreItem>
-</file>
-
-<file path=customXml/itemProps3.xml><?xml version="1.0" encoding="utf-8"?>
-<ds:datastoreItem xmlns:ds="http://schemas.openxmlformats.org/officeDocument/2006/customXml" ds:itemID="{BF698040-0947-4A5E-AAFE-DC44920C1F5E}">
-  <ds:schemaRefs>
-    <ds:schemaRef ds:uri="http://schemas.microsoft.com/office/2006/metadata/properties"/>
-    <ds:schemaRef ds:uri="http://schemas.microsoft.com/office/infopath/2007/PartnerControls"/>
-    <ds:schemaRef ds:uri="247560cf-935a-4eea-8698-2279bd6ff8a8"/>
-  </ds:schemaRefs>
-</ds:datastoreItem>
 </file>
</xml_diff>